<commit_message>
feat: live Twitch EventSub adapter (IRC fallback); cross-session analytics; branded overlays; team management — all gated by plan entitlements
</commit_message>
<xml_diff>
--- a/Glance_Platform_Overview.docx
+++ b/Glance_Platform_Overview.docx
@@ -271,13 +271,13 @@
         <w:rPr>
           <w:b/>
         </w:rPr>
-        <w:t xml:space="preserve">AI summaries.</w:t>
-      </w:r>
-      <w:r>
-        <w:t xml:space="preserve"> </w:t>
-      </w:r>
-      <w:r>
-        <w:t xml:space="preserve">On a configurable cadence, Claude condenses the recent chat into a one-line headline so the creator can absorb the room’s mood at a glance.</w:t>
+        <w:t xml:space="preserve">AI summaries &amp; priority callouts.</w:t>
+      </w:r>
+      <w:r>
+        <w:t xml:space="preserve"> </w:t>
+      </w:r>
+      <w:r>
+        <w:t xml:space="preserve">On a configurable cadence, Claude condenses the recent chat into a one-line headline and re-ranks the top messages so the single most worth-answering one is elevated.</w:t>
       </w:r>
     </w:p>
     <w:p>
@@ -288,31 +288,55 @@
         <w:rPr>
           <w:b/>
         </w:rPr>
-        <w:t xml:space="preserve">Priority callouts.</w:t>
-      </w:r>
-      <w:r>
-        <w:t xml:space="preserve"> </w:t>
-      </w:r>
-      <w:r>
-        <w:t xml:space="preserve">A second AI pass re-ranks the top candidate messages so the single most worth-answering message is elevated — the</w:t>
-      </w:r>
-      <w:r>
-        <w:t xml:space="preserve"> </w:t>
-      </w:r>
-      <w:r>
-        <w:t xml:space="preserve">“</w:t>
-      </w:r>
-      <w:r>
-        <w:t xml:space="preserve">if you only see one thing, see this</w:t>
-      </w:r>
-      <w:r>
-        <w:t xml:space="preserve">”</w:t>
-      </w:r>
-      <w:r>
-        <w:t xml:space="preserve"> </w:t>
-      </w:r>
-      <w:r>
-        <w:t xml:space="preserve">moment.</w:t>
+        <w:t xml:space="preserve">Choose what you hear.</w:t>
+      </w:r>
+      <w:r>
+        <w:t xml:space="preserve"> </w:t>
+      </w:r>
+      <w:r>
+        <w:t xml:space="preserve">A per-category routing matrix lets the creator decide what to</w:t>
+      </w:r>
+      <w:r>
+        <w:t xml:space="preserve"> </w:t>
+      </w:r>
+      <w:r>
+        <w:rPr>
+          <w:i/>
+        </w:rPr>
+        <w:t xml:space="preserve">see</w:t>
+      </w:r>
+      <w:r>
+        <w:t xml:space="preserve">, what to</w:t>
+      </w:r>
+      <w:r>
+        <w:t xml:space="preserve"> </w:t>
+      </w:r>
+      <w:r>
+        <w:rPr>
+          <w:i/>
+        </w:rPr>
+        <w:t xml:space="preserve">hear</w:t>
+      </w:r>
+      <w:r>
+        <w:t xml:space="preserve"> </w:t>
+      </w:r>
+      <w:r>
+        <w:t xml:space="preserve">(spoken aloud), and what gets a quick</w:t>
+      </w:r>
+      <w:r>
+        <w:t xml:space="preserve"> </w:t>
+      </w:r>
+      <w:r>
+        <w:rPr>
+          <w:i/>
+        </w:rPr>
+        <w:t xml:space="preserve">chime</w:t>
+      </w:r>
+      <w:r>
+        <w:t xml:space="preserve"> </w:t>
+      </w:r>
+      <w:r>
+        <w:t xml:space="preserve">— the feature that makes Glance usable hands-free.</w:t>
       </w:r>
     </w:p>
     <w:p>
@@ -323,55 +347,13 @@
         <w:rPr>
           <w:b/>
         </w:rPr>
-        <w:t xml:space="preserve">Choose what you hear.</w:t>
-      </w:r>
-      <w:r>
-        <w:t xml:space="preserve"> </w:t>
-      </w:r>
-      <w:r>
-        <w:t xml:space="preserve">A per-category routing matrix lets the creator decide what to</w:t>
-      </w:r>
-      <w:r>
-        <w:t xml:space="preserve"> </w:t>
-      </w:r>
-      <w:r>
-        <w:rPr>
-          <w:i/>
-        </w:rPr>
-        <w:t xml:space="preserve">see</w:t>
-      </w:r>
-      <w:r>
-        <w:t xml:space="preserve">, what to</w:t>
-      </w:r>
-      <w:r>
-        <w:t xml:space="preserve"> </w:t>
-      </w:r>
-      <w:r>
-        <w:rPr>
-          <w:i/>
-        </w:rPr>
-        <w:t xml:space="preserve">hear</w:t>
-      </w:r>
-      <w:r>
-        <w:t xml:space="preserve"> </w:t>
-      </w:r>
-      <w:r>
-        <w:t xml:space="preserve">(spoken aloud), and what gets a quick</w:t>
-      </w:r>
-      <w:r>
-        <w:t xml:space="preserve"> </w:t>
-      </w:r>
-      <w:r>
-        <w:rPr>
-          <w:i/>
-        </w:rPr>
-        <w:t xml:space="preserve">chime</w:t>
-      </w:r>
-      <w:r>
-        <w:t xml:space="preserve"> </w:t>
-      </w:r>
-      <w:r>
-        <w:t xml:space="preserve">— so a donation can be read aloud while routine chatter stays silent. This is the feature that makes Glance usable hands-free.</w:t>
+        <w:t xml:space="preserve">Moderation radar.</w:t>
+      </w:r>
+      <w:r>
+        <w:t xml:space="preserve"> </w:t>
+      </w:r>
+      <w:r>
+        <w:t xml:space="preserve">Toxic or harassing messages are flagged early, with a creator-tunable sensitivity.</w:t>
       </w:r>
     </w:p>
     <w:p>
@@ -382,13 +364,13 @@
         <w:rPr>
           <w:b/>
         </w:rPr>
-        <w:t xml:space="preserve">Moderation radar.</w:t>
-      </w:r>
-      <w:r>
-        <w:t xml:space="preserve"> </w:t>
-      </w:r>
-      <w:r>
-        <w:t xml:space="preserve">Toxic or harassing messages are flagged early, with a creator-tunable sensitivity, so problems are caught before they escalate.</w:t>
+        <w:t xml:space="preserve">Session replay &amp; cross-session analytics.</w:t>
+      </w:r>
+      <w:r>
+        <w:t xml:space="preserve"> </w:t>
+      </w:r>
+      <w:r>
+        <w:t xml:space="preserve">Every stream is archived (best moments, timeline, AI recap), and a Pro analytics view aggregates across streams — lifetime totals, per-day activity, an all-time supporter leaderboard, busiest streams, and recap history.</w:t>
       </w:r>
     </w:p>
     <w:p>
@@ -399,13 +381,13 @@
         <w:rPr>
           <w:b/>
         </w:rPr>
-        <w:t xml:space="preserve">Session replay &amp; analytics.</w:t>
-      </w:r>
-      <w:r>
-        <w:t xml:space="preserve"> </w:t>
-      </w:r>
-      <w:r>
-        <w:t xml:space="preserve">Every stream is archived into a durable record: headline stats, the best moments, a chronological timeline, and an AI recap — to review after the stream or clip later.</w:t>
+        <w:t xml:space="preserve">Branded overlays &amp; teams.</w:t>
+      </w:r>
+      <w:r>
+        <w:t xml:space="preserve"> </w:t>
+      </w:r>
+      <w:r>
+        <w:t xml:space="preserve">Pro creators can brand the overlay (name, accent, logo) and manage a multi-seat team with roles.</w:t>
       </w:r>
     </w:p>
     <w:p>
@@ -422,7 +404,7 @@
         <w:t xml:space="preserve"> </w:t>
       </w:r>
       <w:r>
-        <w:t xml:space="preserve">The same scored feed streams to any render target over a simple protocol, so a browser overlay, a pair of smart glasses, or a phone companion all consume identical intelligence.</w:t>
+        <w:t xml:space="preserve">The same scored feed streams to any render target over a simple protocol — a browser overlay, smart glasses, or a phone companion.</w:t>
       </w:r>
     </w:p>
     <w:p>
@@ -453,7 +435,7 @@
         <w:t xml:space="preserve"> </w:t>
       </w:r>
       <w:r>
-        <w:t xml:space="preserve">Revenue moments (donations, subs, bits), community moments (raids, great questions) and safety moments (toxicity) are surfaced the instant they happen.</w:t>
+        <w:t xml:space="preserve">Revenue, community and safety moments are surfaced the instant they happen.</w:t>
       </w:r>
     </w:p>
     <w:p>
@@ -474,7 +456,7 @@
         <w:t xml:space="preserve"> </w:t>
       </w:r>
       <w:r>
-        <w:t xml:space="preserve">Eyes stay on the game or the camera, not on a scrolling wall of chat.</w:t>
+        <w:t xml:space="preserve">Eyes stay on the game or camera, not on a scrolling wall of chat.</w:t>
       </w:r>
     </w:p>
     <w:p>
@@ -495,7 +477,7 @@
         <w:t xml:space="preserve"> </w:t>
       </w:r>
       <w:r>
-        <w:t xml:space="preserve">Hearing key callouts is decisive for IRL, VR, just-chatting and console streaming, where watching a second screen is impossible.</w:t>
+        <w:t xml:space="preserve">Hearing key callouts is decisive for IRL, VR, just-chatting and console streaming.</w:t>
       </w:r>
     </w:p>
     <w:p>
@@ -516,7 +498,7 @@
         <w:t xml:space="preserve"> </w:t>
       </w:r>
       <w:r>
-        <w:t xml:space="preserve">Answering the right viewer at the right moment is what grows a community — Glance makes that effortless.</w:t>
+        <w:t xml:space="preserve">Answering the right viewer at the right moment grows a community.</w:t>
       </w:r>
     </w:p>
     <w:p>
@@ -531,34 +513,19 @@
         <w:rPr>
           <w:b/>
         </w:rPr>
-        <w:t xml:space="preserve">Safety by default.</w:t>
-      </w:r>
-      <w:r>
-        <w:t xml:space="preserve"> </w:t>
-      </w:r>
-      <w:r>
-        <w:t xml:space="preserve">Early toxicity signal protects the creator and the room.</w:t>
-      </w:r>
-    </w:p>
-    <w:p>
-      <w:pPr>
-        <w:numPr>
-          <w:ilvl w:val="0"/>
-          <w:numId w:val="1001"/>
-        </w:numPr>
-        <w:pStyle w:val="Compact"/>
-      </w:pPr>
+        <w:t xml:space="preserve">Safety by default</w:t>
+      </w:r>
+      <w:r>
+        <w:t xml:space="preserve">, and</w:t>
+      </w:r>
+      <w:r>
+        <w:t xml:space="preserve"> </w:t>
+      </w:r>
       <w:r>
         <w:rPr>
           <w:b/>
         </w:rPr>
-        <w:t xml:space="preserve">One brain, every platform and device.</w:t>
-      </w:r>
-      <w:r>
-        <w:t xml:space="preserve"> </w:t>
-      </w:r>
-      <w:r>
-        <w:t xml:space="preserve">Switch services or hardware without losing the assistant.</w:t>
+        <w:t xml:space="preserve">one brain across every platform and device.</w:t>
       </w:r>
     </w:p>
     <w:p>
@@ -639,7 +606,7 @@
               <w:jc w:val="left"/>
             </w:pPr>
             <w:r>
-              <w:t xml:space="preserve">Deterministic salience scoring; trend detection; AI summaries; AI priority re-ranking (Claude); sentiment &amp; toxicity analysis</w:t>
+              <w:t xml:space="preserve">Deterministic salience; trend detection; AI summaries; Claude priority re-ranking; sentiment &amp; toxicity</w:t>
             </w:r>
           </w:p>
         </w:tc>
@@ -663,7 +630,7 @@
               <w:jc w:val="left"/>
             </w:pPr>
             <w:r>
-              <w:t xml:space="preserve">Heads-up display (browser/glasses); spoken voice output; earcon chimes; per-category see / hear / chime routing</w:t>
+              <w:t xml:space="preserve">HUD (browser/glasses); spoken voice; earcon chimes; per-category see / hear / chime routing</w:t>
             </w:r>
           </w:p>
         </w:tc>
@@ -687,7 +654,7 @@
               <w:jc w:val="left"/>
             </w:pPr>
             <w:r>
-              <w:t xml:space="preserve">Moderation flagging with tunable sensitivity</w:t>
+              <w:t xml:space="preserve">Moderation flagging with tunable sensitivity (automated actions on Pro)</w:t>
             </w:r>
           </w:p>
         </w:tc>
@@ -711,7 +678,7 @@
               <w:jc w:val="left"/>
             </w:pPr>
             <w:r>
-              <w:t xml:space="preserve">Session recording, replay timeline, top moments, AI recap, analytics dashboard</w:t>
+              <w:t xml:space="preserve">Session recording, replay timeline, top moments, AI recap</w:t>
             </w:r>
           </w:p>
         </w:tc>
@@ -724,18 +691,18 @@
               <w:jc w:val="left"/>
             </w:pPr>
             <w:r>
-              <w:t xml:space="preserve">Platform</w:t>
-            </w:r>
-          </w:p>
-        </w:tc>
-        <w:tc>
-          <w:p>
-            <w:pPr>
-              <w:pStyle w:val="Compact"/>
-              <w:jc w:val="left"/>
-            </w:pPr>
-            <w:r>
-              <w:t xml:space="preserve">Twitch (live), YouTube &amp; Kick (ready to link); demo mode for offline development</w:t>
+              <w:t xml:space="preserve">Analytics</w:t>
+            </w:r>
+          </w:p>
+        </w:tc>
+        <w:tc>
+          <w:p>
+            <w:pPr>
+              <w:pStyle w:val="Compact"/>
+              <w:jc w:val="left"/>
+            </w:pPr>
+            <w:r>
+              <w:t xml:space="preserve">Cross-session lifetime totals, per-day activity, supporter leaderboard, busiest streams (Pro)</w:t>
             </w:r>
           </w:p>
         </w:tc>
@@ -748,6 +715,78 @@
               <w:jc w:val="left"/>
             </w:pPr>
             <w:r>
+              <w:t xml:space="preserve">Platform</w:t>
+            </w:r>
+          </w:p>
+        </w:tc>
+        <w:tc>
+          <w:p>
+            <w:pPr>
+              <w:pStyle w:val="Compact"/>
+              <w:jc w:val="left"/>
+            </w:pPr>
+            <w:r>
+              <w:t xml:space="preserve">Twitch live (IRC + EventSub); YouTube &amp; Kick ready to link; demo mode</w:t>
+            </w:r>
+          </w:p>
+        </w:tc>
+      </w:tr>
+      <w:tr>
+        <w:tc>
+          <w:p>
+            <w:pPr>
+              <w:pStyle w:val="Compact"/>
+              <w:jc w:val="left"/>
+            </w:pPr>
+            <w:r>
+              <w:t xml:space="preserve">Branding</w:t>
+            </w:r>
+          </w:p>
+        </w:tc>
+        <w:tc>
+          <w:p>
+            <w:pPr>
+              <w:pStyle w:val="Compact"/>
+              <w:jc w:val="left"/>
+            </w:pPr>
+            <w:r>
+              <w:t xml:space="preserve">Custom overlay name, accent colour, logo (Pro)</w:t>
+            </w:r>
+          </w:p>
+        </w:tc>
+      </w:tr>
+      <w:tr>
+        <w:tc>
+          <w:p>
+            <w:pPr>
+              <w:pStyle w:val="Compact"/>
+              <w:jc w:val="left"/>
+            </w:pPr>
+            <w:r>
+              <w:t xml:space="preserve">Teams</w:t>
+            </w:r>
+          </w:p>
+        </w:tc>
+        <w:tc>
+          <w:p>
+            <w:pPr>
+              <w:pStyle w:val="Compact"/>
+              <w:jc w:val="left"/>
+            </w:pPr>
+            <w:r>
+              <w:t xml:space="preserve">Multi-seat roster with owner/admin/member roles (Pro)</w:t>
+            </w:r>
+          </w:p>
+        </w:tc>
+      </w:tr>
+      <w:tr>
+        <w:tc>
+          <w:p>
+            <w:pPr>
+              <w:pStyle w:val="Compact"/>
+              <w:jc w:val="left"/>
+            </w:pPr>
+            <w:r>
               <w:t xml:space="preserve">Control</w:t>
             </w:r>
           </w:p>
@@ -759,7 +798,7 @@
               <w:jc w:val="left"/>
             </w:pPr>
             <w:r>
-              <w:t xml:space="preserve">Surface threshold, keywords, summary cadence, AI toggles, routing, privacy/retention, HUD placement &amp; style</w:t>
+              <w:t xml:space="preserve">Threshold, keywords, AI cadence &amp; toggles, routing, privacy/retention, branding, HUD presentation</w:t>
             </w:r>
           </w:p>
         </w:tc>
@@ -780,7 +819,293 @@
         <w:pStyle w:val="FirstParagraph"/>
       </w:pPr>
       <w:r>
-        <w:t xml:space="preserve">Every capability is a creator-facing control, synced across devices (server-owned) or per-device (HUD).</w:t>
+        <w:t xml:space="preserve">Every capability is a creator-facing control, synced across devices (server-owned) or per-device (HUD): surface threshold, keywords, summary cadence, AI summary/priority toggles, moderation + sensitivity, see/hear/chime routing, retention, privacy (no-raw-text) mode, overlay branding, and per-device HUD placement / size / opacity / density / motion / audio.</w:t>
+      </w:r>
+    </w:p>
+    <w:p>
+      <w:pPr>
+        <w:pStyle w:val="Heading1"/>
+      </w:pPr>
+      <w:bookmarkStart w:id="25" w:name="architecture-engineering-quality"/>
+      <w:r>
+        <w:t xml:space="preserve">6. Architecture &amp; engineering quality</w:t>
+      </w:r>
+      <w:bookmarkEnd w:id="25"/>
+    </w:p>
+    <w:p>
+      <w:pPr>
+        <w:pStyle w:val="FirstParagraph"/>
+      </w:pPr>
+      <w:r>
+        <w:t xml:space="preserve">Three deliberate seams keep Glance future-proof:</w:t>
+      </w:r>
+      <w:r>
+        <w:t xml:space="preserve"> </w:t>
+      </w:r>
+      <w:r>
+        <w:rPr>
+          <w:b/>
+        </w:rPr>
+        <w:t xml:space="preserve">PlatformAdapter</w:t>
+      </w:r>
+      <w:r>
+        <w:t xml:space="preserve"> </w:t>
+      </w:r>
+      <w:r>
+        <w:t xml:space="preserve">(Twitch/YouTube/Kick),</w:t>
+      </w:r>
+      <w:r>
+        <w:t xml:space="preserve"> </w:t>
+      </w:r>
+      <w:r>
+        <w:rPr>
+          <w:b/>
+        </w:rPr>
+        <w:t xml:space="preserve">AIProvider</w:t>
+      </w:r>
+      <w:r>
+        <w:t xml:space="preserve"> </w:t>
+      </w:r>
+      <w:r>
+        <w:t xml:space="preserve">(Claude or deterministic rules), and</w:t>
+      </w:r>
+      <w:r>
+        <w:t xml:space="preserve"> </w:t>
+      </w:r>
+      <w:r>
+        <w:rPr>
+          <w:b/>
+        </w:rPr>
+        <w:t xml:space="preserve">RenderTarget</w:t>
+      </w:r>
+      <w:r>
+        <w:t xml:space="preserve"> </w:t>
+      </w:r>
+      <w:r>
+        <w:t xml:space="preserve">(browser HUD, audio, future glasses).</w:t>
+      </w:r>
+    </w:p>
+    <w:p>
+      <w:pPr>
+        <w:numPr>
+          <w:ilvl w:val="0"/>
+          <w:numId w:val="1002"/>
+        </w:numPr>
+        <w:pStyle w:val="Compact"/>
+      </w:pPr>
+      <w:r>
+        <w:rPr>
+          <w:b/>
+        </w:rPr>
+        <w:t xml:space="preserve">Scale &amp; isolation.</w:t>
+      </w:r>
+      <w:r>
+        <w:t xml:space="preserve"> </w:t>
+      </w:r>
+      <w:r>
+        <w:t xml:space="preserve">Multi-tenant: every creator gets a fully isolated pipeline; broadcasts fan out through a tenant-keyed pub/sub Bus (in-process now, Redis-droppable). Tenant isolation is unit-tested.</w:t>
+      </w:r>
+    </w:p>
+    <w:p>
+      <w:pPr>
+        <w:numPr>
+          <w:ilvl w:val="0"/>
+          <w:numId w:val="1002"/>
+        </w:numPr>
+        <w:pStyle w:val="Compact"/>
+      </w:pPr>
+      <w:r>
+        <w:rPr>
+          <w:b/>
+        </w:rPr>
+        <w:t xml:space="preserve">Security.</w:t>
+      </w:r>
+      <w:r>
+        <w:t xml:space="preserve"> </w:t>
+      </w:r>
+      <w:r>
+        <w:t xml:space="preserve">HMAC-signed, expiring tokens on REST + WebSocket; per-IP rate limiting; crypto-strong IDs; encryption-at-rest for linked-platform tokens; a production guard.</w:t>
+      </w:r>
+    </w:p>
+    <w:p>
+      <w:pPr>
+        <w:numPr>
+          <w:ilvl w:val="0"/>
+          <w:numId w:val="1002"/>
+        </w:numPr>
+        <w:pStyle w:val="Compact"/>
+      </w:pPr>
+      <w:r>
+        <w:rPr>
+          <w:b/>
+        </w:rPr>
+        <w:t xml:space="preserve">Data protection.</w:t>
+      </w:r>
+      <w:r>
+        <w:t xml:space="preserve"> </w:t>
+      </w:r>
+      <w:r>
+        <w:t xml:space="preserve">Configurable retention with auto-pruning, privacy mode, export, channel-level erasure — all tenant-scoped.</w:t>
+      </w:r>
+    </w:p>
+    <w:p>
+      <w:pPr>
+        <w:numPr>
+          <w:ilvl w:val="0"/>
+          <w:numId w:val="1002"/>
+        </w:numPr>
+        <w:pStyle w:val="Compact"/>
+      </w:pPr>
+      <w:r>
+        <w:rPr>
+          <w:b/>
+        </w:rPr>
+        <w:t xml:space="preserve">Monetization controls.</w:t>
+      </w:r>
+      <w:r>
+        <w:t xml:space="preserve"> </w:t>
+      </w:r>
+      <w:r>
+        <w:t xml:space="preserve">Plan entitlements clamp settings centrally; AI usage is metered per tenant against a daily cap.</w:t>
+      </w:r>
+    </w:p>
+    <w:p>
+      <w:pPr>
+        <w:numPr>
+          <w:ilvl w:val="0"/>
+          <w:numId w:val="1002"/>
+        </w:numPr>
+        <w:pStyle w:val="Compact"/>
+      </w:pPr>
+      <w:r>
+        <w:rPr>
+          <w:b/>
+        </w:rPr>
+        <w:t xml:space="preserve">Operability.</w:t>
+      </w:r>
+      <w:r>
+        <w:t xml:space="preserve"> </w:t>
+      </w:r>
+      <w:r>
+        <w:t xml:space="preserve">Structured logs, Prometheus metrics, health/ready probes, config validation, graceful shutdown, Dockerfile, CI, and automated dependency PRs.</w:t>
+      </w:r>
+    </w:p>
+    <w:p>
+      <w:pPr>
+        <w:pStyle w:val="FirstParagraph"/>
+      </w:pPr>
+      <w:r>
+        <w:t xml:space="preserve">Audited across eight dimensions and hardened until every one met or exceeded an A− bar.</w:t>
+      </w:r>
+    </w:p>
+    <w:p>
+      <w:pPr>
+        <w:pStyle w:val="Heading1"/>
+      </w:pPr>
+      <w:bookmarkStart w:id="26" w:name="integrations"/>
+      <w:r>
+        <w:t xml:space="preserve">7. Integrations</w:t>
+      </w:r>
+      <w:bookmarkEnd w:id="26"/>
+    </w:p>
+    <w:p>
+      <w:pPr>
+        <w:pStyle w:val="FirstParagraph"/>
+      </w:pPr>
+      <w:r>
+        <w:t xml:space="preserve">The OAuth pipelines (Twitch/YouTube/Kick) and Stripe billing are built and unit-tested. The</w:t>
+      </w:r>
+      <w:r>
+        <w:t xml:space="preserve"> </w:t>
+      </w:r>
+      <w:r>
+        <w:rPr>
+          <w:b/>
+        </w:rPr>
+        <w:t xml:space="preserve">Twitch EventSub adapter is built</w:t>
+      </w:r>
+      <w:r>
+        <w:t xml:space="preserve"> </w:t>
+      </w:r>
+      <w:r>
+        <w:t xml:space="preserve">and auto-selected for any tenant with a linked token (IRC fallback otherwise). Linking the providers live and taking Stripe live are credentials-and-test steps. See</w:t>
+      </w:r>
+      <w:r>
+        <w:t xml:space="preserve"> </w:t>
+      </w:r>
+      <w:r>
+        <w:rPr>
+          <w:rStyle w:val="VerbatimChar"/>
+        </w:rPr>
+        <w:t xml:space="preserve">docs/INTEGRATIONS.md</w:t>
+      </w:r>
+      <w:r>
+        <w:t xml:space="preserve">.</w:t>
+      </w:r>
+    </w:p>
+    <w:p>
+      <w:pPr>
+        <w:pStyle w:val="BodyText"/>
+      </w:pPr>
+      <w:r>
+        <w:rPr>
+          <w:b/>
+        </w:rPr>
+        <w:t xml:space="preserve">SDK &amp; devices.</w:t>
+      </w:r>
+      <w:r>
+        <w:t xml:space="preserve"> </w:t>
+      </w:r>
+      <w:r>
+        <w:t xml:space="preserve">The server’s scored feed is render-agnostic over a single WebSocket protocol — that protocol is the integration surface. Planned: a typed</w:t>
+      </w:r>
+      <w:r>
+        <w:t xml:space="preserve"> </w:t>
+      </w:r>
+      <w:r>
+        <w:rPr>
+          <w:rStyle w:val="VerbatimChar"/>
+        </w:rPr>
+        <w:t xml:space="preserve">@glance/sdk</w:t>
+      </w:r>
+      <w:r>
+        <w:t xml:space="preserve"> </w:t>
+      </w:r>
+      <w:r>
+        <w:t xml:space="preserve">client, a smart-glasses web-app target, and a phone companion that pairs to the tenant and renders the routed audio (so a creator streaming Twitch from a console still hears callouts in an earbud).</w:t>
+      </w:r>
+    </w:p>
+    <w:p>
+      <w:pPr>
+        <w:pStyle w:val="Heading1"/>
+      </w:pPr>
+      <w:bookmarkStart w:id="27" w:name="monetization"/>
+      <w:r>
+        <w:t xml:space="preserve">8. Monetization</w:t>
+      </w:r>
+      <w:bookmarkEnd w:id="27"/>
+    </w:p>
+    <w:p>
+      <w:pPr>
+        <w:pStyle w:val="FirstParagraph"/>
+      </w:pPr>
+      <w:r>
+        <w:t xml:space="preserve">Subscriptions are embedded via Stripe (Checkout + Customer Portal) with</w:t>
+      </w:r>
+      <w:r>
+        <w:t xml:space="preserve"> </w:t>
+      </w:r>
+      <w:r>
+        <w:rPr>
+          <w:b/>
+        </w:rPr>
+        <w:t xml:space="preserve">webhook-first provisioning</w:t>
+      </w:r>
+      <w:r>
+        <w:t xml:space="preserve"> </w:t>
+      </w:r>
+      <w:r>
+        <w:t xml:space="preserve">and constant-time, replay-protected signature verification. A tenant’s plan is enforced centrally: settings are clamped to entitlements, and AI usage is capped per day.</w:t>
       </w:r>
     </w:p>
     <w:tbl>
@@ -790,9 +1115,18 @@
         <w:tblLook w:firstRow="1"/>
       </w:tblPr>
       <w:tblGrid>
-        <w:gridCol w:w="2376"/>
-        <w:gridCol w:w="3696"/>
-        <w:gridCol w:w="1848"/>
+        <w:gridCol w:w="617"/>
+        <w:gridCol w:w="617"/>
+        <w:gridCol w:w="1440"/>
+        <w:gridCol w:w="1131"/>
+        <w:gridCol w:w="514"/>
+        <w:gridCol w:w="514"/>
+        <w:gridCol w:w="514"/>
+        <w:gridCol w:w="514"/>
+        <w:gridCol w:w="514"/>
+        <w:gridCol w:w="514"/>
+        <w:gridCol w:w="514"/>
+        <w:gridCol w:w="514"/>
       </w:tblGrid>
       <w:tr>
         <w:trPr>
@@ -811,7 +1145,7 @@
               <w:jc w:val="left"/>
             </w:pPr>
             <w:r>
-              <w:t xml:space="preserve">Setting</w:t>
+              <w:t xml:space="preserve">Plan</w:t>
             </w:r>
           </w:p>
         </w:tc>
@@ -825,10 +1159,10 @@
           <w:p>
             <w:pPr>
               <w:pStyle w:val="Compact"/>
-              <w:jc w:val="left"/>
-            </w:pPr>
-            <w:r>
-              <w:t xml:space="preserve">What it does</w:t>
+              <w:jc w:val="right"/>
+            </w:pPr>
+            <w:r>
+              <w:t xml:space="preserve">$/mo</w:t>
             </w:r>
           </w:p>
         </w:tc>
@@ -842,616 +1176,13 @@
           <w:p>
             <w:pPr>
               <w:pStyle w:val="Compact"/>
-              <w:jc w:val="left"/>
-            </w:pPr>
-            <w:r>
-              <w:t xml:space="preserve">Where</w:t>
-            </w:r>
-          </w:p>
-        </w:tc>
-      </w:tr>
-      <w:tr>
-        <w:tc>
-          <w:p>
-            <w:pPr>
-              <w:pStyle w:val="Compact"/>
-              <w:jc w:val="left"/>
-            </w:pPr>
-            <w:r>
-              <w:t xml:space="preserve">Surface threshold</w:t>
-            </w:r>
-          </w:p>
-        </w:tc>
-        <w:tc>
-          <w:p>
-            <w:pPr>
-              <w:pStyle w:val="Compact"/>
-              <w:jc w:val="left"/>
-            </w:pPr>
-            <w:r>
-              <w:t xml:space="preserve">How important a message must be to break through</w:t>
-            </w:r>
-          </w:p>
-        </w:tc>
-        <w:tc>
-          <w:p>
-            <w:pPr>
-              <w:pStyle w:val="Compact"/>
-              <w:jc w:val="left"/>
-            </w:pPr>
-            <w:r>
-              <w:t xml:space="preserve">Command Center</w:t>
-            </w:r>
-          </w:p>
-        </w:tc>
-      </w:tr>
-      <w:tr>
-        <w:tc>
-          <w:p>
-            <w:pPr>
-              <w:pStyle w:val="Compact"/>
-              <w:jc w:val="left"/>
-            </w:pPr>
-            <w:r>
-              <w:t xml:space="preserve">Keywords</w:t>
-            </w:r>
-          </w:p>
-        </w:tc>
-        <w:tc>
-          <w:p>
-            <w:pPr>
-              <w:pStyle w:val="Compact"/>
-              <w:jc w:val="left"/>
-            </w:pPr>
-            <w:r>
-              <w:t xml:space="preserve">Terms that boost a message’s importance</w:t>
-            </w:r>
-          </w:p>
-        </w:tc>
-        <w:tc>
-          <w:p>
-            <w:pPr>
-              <w:pStyle w:val="Compact"/>
-              <w:jc w:val="left"/>
-            </w:pPr>
-            <w:r>
-              <w:t xml:space="preserve">Command Center</w:t>
-            </w:r>
-          </w:p>
-        </w:tc>
-      </w:tr>
-      <w:tr>
-        <w:tc>
-          <w:p>
-            <w:pPr>
-              <w:pStyle w:val="Compact"/>
-              <w:jc w:val="left"/>
-            </w:pPr>
-            <w:r>
-              <w:t xml:space="preserve">Summary cadence</w:t>
-            </w:r>
-          </w:p>
-        </w:tc>
-        <w:tc>
-          <w:p>
-            <w:pPr>
-              <w:pStyle w:val="Compact"/>
-              <w:jc w:val="left"/>
-            </w:pPr>
-            <w:r>
-              <w:t xml:space="preserve">How often the AI headline refreshes</w:t>
-            </w:r>
-          </w:p>
-        </w:tc>
-        <w:tc>
-          <w:p>
-            <w:pPr>
-              <w:pStyle w:val="Compact"/>
-              <w:jc w:val="left"/>
-            </w:pPr>
-            <w:r>
-              <w:t xml:space="preserve">Command Center</w:t>
-            </w:r>
-          </w:p>
-        </w:tc>
-      </w:tr>
-      <w:tr>
-        <w:tc>
-          <w:p>
-            <w:pPr>
-              <w:pStyle w:val="Compact"/>
-              <w:jc w:val="left"/>
-            </w:pPr>
-            <w:r>
-              <w:t xml:space="preserve">AI summaries</w:t>
-            </w:r>
-          </w:p>
-        </w:tc>
-        <w:tc>
-          <w:p>
-            <w:pPr>
-              <w:pStyle w:val="Compact"/>
-              <w:jc w:val="left"/>
-            </w:pPr>
-            <w:r>
-              <w:t xml:space="preserve">Turn the periodic AI headline on/off</w:t>
-            </w:r>
-          </w:p>
-        </w:tc>
-        <w:tc>
-          <w:p>
-            <w:pPr>
-              <w:pStyle w:val="Compact"/>
-              <w:jc w:val="left"/>
-            </w:pPr>
-            <w:r>
-              <w:t xml:space="preserve">Command Center</w:t>
-            </w:r>
-          </w:p>
-        </w:tc>
-      </w:tr>
-      <w:tr>
-        <w:tc>
-          <w:p>
-            <w:pPr>
-              <w:pStyle w:val="Compact"/>
-              <w:jc w:val="left"/>
-            </w:pPr>
-            <w:r>
-              <w:t xml:space="preserve">AI priority callouts</w:t>
-            </w:r>
-          </w:p>
-        </w:tc>
-        <w:tc>
-          <w:p>
-            <w:pPr>
-              <w:pStyle w:val="Compact"/>
-              <w:jc w:val="left"/>
-            </w:pPr>
-            <w:r>
-              <w:t xml:space="preserve">Turn Claude re-ranking on/off</w:t>
-            </w:r>
-          </w:p>
-        </w:tc>
-        <w:tc>
-          <w:p>
-            <w:pPr>
-              <w:pStyle w:val="Compact"/>
-              <w:jc w:val="left"/>
-            </w:pPr>
-            <w:r>
-              <w:t xml:space="preserve">Command Center</w:t>
-            </w:r>
-          </w:p>
-        </w:tc>
-      </w:tr>
-      <w:tr>
-        <w:tc>
-          <w:p>
-            <w:pPr>
-              <w:pStyle w:val="Compact"/>
-              <w:jc w:val="left"/>
-            </w:pPr>
-            <w:r>
-              <w:t xml:space="preserve">Moderation + sensitivity</w:t>
-            </w:r>
-          </w:p>
-        </w:tc>
-        <w:tc>
-          <w:p>
-            <w:pPr>
-              <w:pStyle w:val="Compact"/>
-              <w:jc w:val="left"/>
-            </w:pPr>
-            <w:r>
-              <w:t xml:space="preserve">Flag toxicity; how strict</w:t>
-            </w:r>
-          </w:p>
-        </w:tc>
-        <w:tc>
-          <w:p>
-            <w:pPr>
-              <w:pStyle w:val="Compact"/>
-              <w:jc w:val="left"/>
-            </w:pPr>
-            <w:r>
-              <w:t xml:space="preserve">Command Center</w:t>
-            </w:r>
-          </w:p>
-        </w:tc>
-      </w:tr>
-      <w:tr>
-        <w:tc>
-          <w:p>
-            <w:pPr>
-              <w:pStyle w:val="Compact"/>
-              <w:jc w:val="left"/>
-            </w:pPr>
-            <w:r>
-              <w:t xml:space="preserve">Routing matrix</w:t>
-            </w:r>
-          </w:p>
-        </w:tc>
-        <w:tc>
-          <w:p>
-            <w:pPr>
-              <w:pStyle w:val="Compact"/>
-              <w:jc w:val="left"/>
-            </w:pPr>
-            <w:r>
-              <w:t xml:space="preserve">See / hear / chime, per category</w:t>
-            </w:r>
-          </w:p>
-        </w:tc>
-        <w:tc>
-          <w:p>
-            <w:pPr>
-              <w:pStyle w:val="Compact"/>
-              <w:jc w:val="left"/>
-            </w:pPr>
-            <w:r>
-              <w:t xml:space="preserve">Command Center</w:t>
-            </w:r>
-          </w:p>
-        </w:tc>
-      </w:tr>
-      <w:tr>
-        <w:tc>
-          <w:p>
-            <w:pPr>
-              <w:pStyle w:val="Compact"/>
-              <w:jc w:val="left"/>
-            </w:pPr>
-            <w:r>
-              <w:t xml:space="preserve">Retention</w:t>
-            </w:r>
-          </w:p>
-        </w:tc>
-        <w:tc>
-          <w:p>
-            <w:pPr>
-              <w:pStyle w:val="Compact"/>
-              <w:jc w:val="left"/>
-            </w:pPr>
-            <w:r>
-              <w:t xml:space="preserve">Auto-delete archives after N days</w:t>
-            </w:r>
-          </w:p>
-        </w:tc>
-        <w:tc>
-          <w:p>
-            <w:pPr>
-              <w:pStyle w:val="Compact"/>
-              <w:jc w:val="left"/>
-            </w:pPr>
-            <w:r>
-              <w:t xml:space="preserve">Command Center (privacy)</w:t>
-            </w:r>
-          </w:p>
-        </w:tc>
-      </w:tr>
-      <w:tr>
-        <w:tc>
-          <w:p>
-            <w:pPr>
-              <w:pStyle w:val="Compact"/>
-              <w:jc w:val="left"/>
-            </w:pPr>
-            <w:r>
-              <w:t xml:space="preserve">Store message text</w:t>
-            </w:r>
-          </w:p>
-        </w:tc>
-        <w:tc>
-          <w:p>
-            <w:pPr>
-              <w:pStyle w:val="Compact"/>
-              <w:jc w:val="left"/>
-            </w:pPr>
-            <w:r>
-              <w:t xml:space="preserve">Privacy mode — keep metadata only, not raw text</w:t>
-            </w:r>
-          </w:p>
-        </w:tc>
-        <w:tc>
-          <w:p>
-            <w:pPr>
-              <w:pStyle w:val="Compact"/>
-              <w:jc w:val="left"/>
-            </w:pPr>
-            <w:r>
-              <w:t xml:space="preserve">Command Center (privacy)</w:t>
-            </w:r>
-          </w:p>
-        </w:tc>
-      </w:tr>
-      <w:tr>
-        <w:tc>
-          <w:p>
-            <w:pPr>
-              <w:pStyle w:val="Compact"/>
-              <w:jc w:val="left"/>
-            </w:pPr>
-            <w:r>
-              <w:t xml:space="preserve">Mode</w:t>
-            </w:r>
-          </w:p>
-        </w:tc>
-        <w:tc>
-          <w:p>
-            <w:pPr>
-              <w:pStyle w:val="Compact"/>
-              <w:jc w:val="left"/>
-            </w:pPr>
-            <w:r>
-              <w:t xml:space="preserve">Raw / Assist / Hybrid surfacing</w:t>
-            </w:r>
-          </w:p>
-        </w:tc>
-        <w:tc>
-          <w:p>
-            <w:pPr>
-              <w:pStyle w:val="Compact"/>
-              <w:jc w:val="left"/>
-            </w:pPr>
-            <w:r>
-              <w:t xml:space="preserve">HUD (per device)</w:t>
-            </w:r>
-          </w:p>
-        </w:tc>
-      </w:tr>
-      <w:tr>
-        <w:tc>
-          <w:p>
-            <w:pPr>
-              <w:pStyle w:val="Compact"/>
-              <w:jc w:val="left"/>
-            </w:pPr>
-            <w:r>
-              <w:t xml:space="preserve">Placement, size, opacity, density, motion</w:t>
-            </w:r>
-          </w:p>
-        </w:tc>
-        <w:tc>
-          <w:p>
-            <w:pPr>
-              <w:pStyle w:val="Compact"/>
-              <w:jc w:val="left"/>
-            </w:pPr>
-            <w:r>
-              <w:t xml:space="preserve">Presentation</w:t>
-            </w:r>
-          </w:p>
-        </w:tc>
-        <w:tc>
-          <w:p>
-            <w:pPr>
-              <w:pStyle w:val="Compact"/>
-              <w:jc w:val="left"/>
-            </w:pPr>
-            <w:r>
-              <w:t xml:space="preserve">HUD (per device)</w:t>
-            </w:r>
-          </w:p>
-        </w:tc>
-      </w:tr>
-      <w:tr>
-        <w:tc>
-          <w:p>
-            <w:pPr>
-              <w:pStyle w:val="Compact"/>
-              <w:jc w:val="left"/>
-            </w:pPr>
-            <w:r>
-              <w:t xml:space="preserve">Audio output + volume</w:t>
-            </w:r>
-          </w:p>
-        </w:tc>
-        <w:tc>
-          <w:p>
-            <w:pPr>
-              <w:pStyle w:val="Compact"/>
-              <w:jc w:val="left"/>
-            </w:pPr>
-            <w:r>
-              <w:t xml:space="preserve">Spoken output on/off and level</w:t>
-            </w:r>
-          </w:p>
-        </w:tc>
-        <w:tc>
-          <w:p>
-            <w:pPr>
-              <w:pStyle w:val="Compact"/>
-              <w:jc w:val="left"/>
-            </w:pPr>
-            <w:r>
-              <w:t xml:space="preserve">HUD (per device)</w:t>
-            </w:r>
-          </w:p>
-        </w:tc>
-      </w:tr>
-    </w:tbl>
-    <w:p>
-      <w:pPr>
-        <w:pStyle w:val="Heading1"/>
-      </w:pPr>
-      <w:bookmarkStart w:id="25" w:name="architecture-engineering-quality"/>
-      <w:r>
-        <w:t xml:space="preserve">6. Architecture &amp; engineering quality</w:t>
-      </w:r>
-      <w:bookmarkEnd w:id="25"/>
-    </w:p>
-    <w:p>
-      <w:pPr>
-        <w:pStyle w:val="FirstParagraph"/>
-      </w:pPr>
-      <w:r>
-        <w:t xml:space="preserve">Glance is a TypeScript monorepo with three deliberate seams that keep it future-proof:</w:t>
-      </w:r>
-    </w:p>
-    <w:p>
-      <w:pPr>
-        <w:numPr>
-          <w:ilvl w:val="0"/>
-          <w:numId w:val="1002"/>
-        </w:numPr>
-        <w:pStyle w:val="Compact"/>
-      </w:pPr>
-      <w:r>
-        <w:rPr>
-          <w:b/>
-        </w:rPr>
-        <w:t xml:space="preserve">PlatformAdapter</w:t>
-      </w:r>
-      <w:r>
-        <w:t xml:space="preserve"> </w:t>
-      </w:r>
-      <w:r>
-        <w:t xml:space="preserve">— Twitch / YouTube / Kick behind one interface, so a new platform is a new adapter, not a rewrite.</w:t>
-      </w:r>
-    </w:p>
-    <w:p>
-      <w:pPr>
-        <w:numPr>
-          <w:ilvl w:val="0"/>
-          <w:numId w:val="1002"/>
-        </w:numPr>
-        <w:pStyle w:val="Compact"/>
-      </w:pPr>
-      <w:r>
-        <w:rPr>
-          <w:b/>
-        </w:rPr>
-        <w:t xml:space="preserve">AIProvider</w:t>
-      </w:r>
-      <w:r>
-        <w:t xml:space="preserve"> </w:t>
-      </w:r>
-      <w:r>
-        <w:t xml:space="preserve">— Claude or a deterministic rules engine behind one interface (summarize + prioritize).</w:t>
-      </w:r>
-    </w:p>
-    <w:p>
-      <w:pPr>
-        <w:numPr>
-          <w:ilvl w:val="0"/>
-          <w:numId w:val="1002"/>
-        </w:numPr>
-        <w:pStyle w:val="Compact"/>
-      </w:pPr>
-      <w:r>
-        <w:rPr>
-          <w:b/>
-        </w:rPr>
-        <w:t xml:space="preserve">RenderTarget</w:t>
-      </w:r>
-      <w:r>
-        <w:t xml:space="preserve"> </w:t>
-      </w:r>
-      <w:r>
-        <w:t xml:space="preserve">— browser HUD, audio, or future glasses all consume one streamed message protocol.</w:t>
-      </w:r>
-    </w:p>
-    <w:p>
-      <w:pPr>
-        <w:pStyle w:val="FirstParagraph"/>
-      </w:pPr>
-      <w:r>
-        <w:rPr>
-          <w:b/>
-        </w:rPr>
-        <w:t xml:space="preserve">Scale &amp; isolation.</w:t>
-      </w:r>
-      <w:r>
-        <w:t xml:space="preserve"> </w:t>
-      </w:r>
-      <w:r>
-        <w:t xml:space="preserve">The server is multi-tenant: every creator gets a fully isolated pipeline (own engine, settings, storage), broadcasts are fanned out through a tenant-keyed pub/sub Bus (in-process now, Redis-droppable for horizontal scale), and the WebSocket gateway routes each socket only to its tenant’s room. Tenant isolation is unit-tested — one creator can never see another’s data.</w:t>
-      </w:r>
-    </w:p>
-    <w:p>
-      <w:pPr>
-        <w:pStyle w:val="BodyText"/>
-      </w:pPr>
-      <w:r>
-        <w:rPr>
-          <w:b/>
-        </w:rPr>
-        <w:t xml:space="preserve">Security.</w:t>
-      </w:r>
-      <w:r>
-        <w:t xml:space="preserve"> </w:t>
-      </w:r>
-      <w:r>
-        <w:t xml:space="preserve">HMAC-signed, expiring tenant tokens on every REST and WebSocket connection; per-IP rate limiting; crypto-strong session IDs; encryption-at-rest for linked-platform tokens; a production guard that refuses to boot without auth configured.</w:t>
-      </w:r>
-    </w:p>
-    <w:p>
-      <w:pPr>
-        <w:pStyle w:val="BodyText"/>
-      </w:pPr>
-      <w:r>
-        <w:rPr>
-          <w:b/>
-        </w:rPr>
-        <w:t xml:space="preserve">Data protection.</w:t>
-      </w:r>
-      <w:r>
-        <w:t xml:space="preserve"> </w:t>
-      </w:r>
-      <w:r>
-        <w:t xml:space="preserve">Configurable retention with automatic pruning; a privacy mode that stores metadata without raw message text; full data export (portability); and channel-level erasure (right to be forgotten) — all tenant-scoped.</w:t>
-      </w:r>
-    </w:p>
-    <w:p>
-      <w:pPr>
-        <w:pStyle w:val="BodyText"/>
-      </w:pPr>
-      <w:r>
-        <w:rPr>
-          <w:b/>
-        </w:rPr>
-        <w:t xml:space="preserve">Operability.</w:t>
-      </w:r>
-      <w:r>
-        <w:t xml:space="preserve"> </w:t>
-      </w:r>
-      <w:r>
-        <w:t xml:space="preserve">Structured JSON logging, Prometheus metrics, health/ready probes, fail-fast config validation, graceful shutdown that archives in-flight sessions, a Dockerfile and a CI pipeline (typecheck → lint → test → build).</w:t>
-      </w:r>
-    </w:p>
-    <w:p>
-      <w:pPr>
-        <w:pStyle w:val="Heading2"/>
-      </w:pPr>
-      <w:bookmarkStart w:id="26" w:name="engineering-scorecard"/>
-      <w:r>
-        <w:t xml:space="preserve">Engineering scorecard</w:t>
-      </w:r>
-      <w:bookmarkEnd w:id="26"/>
-    </w:p>
-    <w:p>
-      <w:pPr>
-        <w:pStyle w:val="FirstParagraph"/>
-      </w:pPr>
-      <w:r>
-        <w:t xml:space="preserve">The platform was audited across eight dimensions and hardened until every one met or exceeded an A− bar.</w:t>
-      </w:r>
-    </w:p>
-    <w:tbl>
-      <w:tblPr>
-        <w:tblStyle w:val="Table"/>
-        <w:tblW w:type="pct" w:w="5000.0"/>
-        <w:tblLook w:firstRow="1"/>
-      </w:tblPr>
-      <w:tblGrid>
-        <w:gridCol w:w="4585"/>
-        <w:gridCol w:w="3334"/>
-      </w:tblGrid>
-      <w:tr>
-        <w:trPr>
-          <w:cnfStyle w:firstRow="1"/>
-        </w:trPr>
+              <w:jc w:val="right"/>
+            </w:pPr>
+            <w:r>
+              <w:t xml:space="preserve">AI calls/day</w:t>
+            </w:r>
+          </w:p>
+        </w:tc>
         <w:tc>
           <w:tcPr>
             <w:tcBorders>
@@ -1465,7 +1196,7 @@
               <w:jc w:val="left"/>
             </w:pPr>
             <w:r>
-              <w:t xml:space="preserve">Dimension</w:t>
+              <w:t xml:space="preserve">Retention</w:t>
             </w:r>
           </w:p>
         </w:tc>
@@ -1479,236 +1210,13 @@
           <w:p>
             <w:pPr>
               <w:pStyle w:val="Compact"/>
-              <w:jc w:val="left"/>
-            </w:pPr>
-            <w:r>
-              <w:t xml:space="preserve">Status</w:t>
-            </w:r>
-          </w:p>
-        </w:tc>
-      </w:tr>
-      <w:tr>
-        <w:tc>
-          <w:p>
-            <w:pPr>
-              <w:pStyle w:val="Compact"/>
-              <w:jc w:val="left"/>
-            </w:pPr>
-            <w:r>
-              <w:t xml:space="preserve">Feature completeness</w:t>
-            </w:r>
-          </w:p>
-        </w:tc>
-        <w:tc>
-          <w:p>
-            <w:pPr>
-              <w:pStyle w:val="Compact"/>
-              <w:jc w:val="left"/>
-            </w:pPr>
-            <w:r>
-              <w:t xml:space="preserve">A−</w:t>
-            </w:r>
-          </w:p>
-        </w:tc>
-      </w:tr>
-      <w:tr>
-        <w:tc>
-          <w:p>
-            <w:pPr>
-              <w:pStyle w:val="Compact"/>
-              <w:jc w:val="left"/>
-            </w:pPr>
-            <w:r>
-              <w:t xml:space="preserve">Scalability / multi-tenancy</w:t>
-            </w:r>
-          </w:p>
-        </w:tc>
-        <w:tc>
-          <w:p>
-            <w:pPr>
-              <w:pStyle w:val="Compact"/>
-              <w:jc w:val="left"/>
-            </w:pPr>
-            <w:r>
-              <w:t xml:space="preserve">A−</w:t>
-            </w:r>
-          </w:p>
-        </w:tc>
-      </w:tr>
-      <w:tr>
-        <w:tc>
-          <w:p>
-            <w:pPr>
-              <w:pStyle w:val="Compact"/>
-              <w:jc w:val="left"/>
-            </w:pPr>
-            <w:r>
-              <w:t xml:space="preserve">Security &amp; auth</w:t>
-            </w:r>
-          </w:p>
-        </w:tc>
-        <w:tc>
-          <w:p>
-            <w:pPr>
-              <w:pStyle w:val="Compact"/>
-              <w:jc w:val="left"/>
-            </w:pPr>
-            <w:r>
-              <w:t xml:space="preserve">A−</w:t>
-            </w:r>
-          </w:p>
-        </w:tc>
-      </w:tr>
-      <w:tr>
-        <w:tc>
-          <w:p>
-            <w:pPr>
-              <w:pStyle w:val="Compact"/>
-              <w:jc w:val="left"/>
-            </w:pPr>
-            <w:r>
-              <w:t xml:space="preserve">Data-protection &amp; compliance</w:t>
-            </w:r>
-          </w:p>
-        </w:tc>
-        <w:tc>
-          <w:p>
-            <w:pPr>
-              <w:pStyle w:val="Compact"/>
-              <w:jc w:val="left"/>
-            </w:pPr>
-            <w:r>
-              <w:t xml:space="preserve">A−</w:t>
-            </w:r>
-          </w:p>
-        </w:tc>
-      </w:tr>
-      <w:tr>
-        <w:tc>
-          <w:p>
-            <w:pPr>
-              <w:pStyle w:val="Compact"/>
-              <w:jc w:val="left"/>
-            </w:pPr>
-            <w:r>
-              <w:t xml:space="preserve">Observability &amp; ops</w:t>
-            </w:r>
-          </w:p>
-        </w:tc>
-        <w:tc>
-          <w:p>
-            <w:pPr>
-              <w:pStyle w:val="Compact"/>
-              <w:jc w:val="left"/>
-            </w:pPr>
-            <w:r>
-              <w:t xml:space="preserve">A−</w:t>
-            </w:r>
-          </w:p>
-        </w:tc>
-      </w:tr>
-      <w:tr>
-        <w:tc>
-          <w:p>
-            <w:pPr>
-              <w:pStyle w:val="Compact"/>
-              <w:jc w:val="left"/>
-            </w:pPr>
-            <w:r>
-              <w:t xml:space="preserve">Test coverage</w:t>
-            </w:r>
-          </w:p>
-        </w:tc>
-        <w:tc>
-          <w:p>
-            <w:pPr>
-              <w:pStyle w:val="Compact"/>
-              <w:jc w:val="left"/>
-            </w:pPr>
-            <w:r>
-              <w:t xml:space="preserve">A−</w:t>
-            </w:r>
-          </w:p>
-        </w:tc>
-      </w:tr>
-      <w:tr>
-        <w:tc>
-          <w:p>
-            <w:pPr>
-              <w:pStyle w:val="Compact"/>
-              <w:jc w:val="left"/>
-            </w:pPr>
-            <w:r>
-              <w:t xml:space="preserve">Dependency currency</w:t>
-            </w:r>
-          </w:p>
-        </w:tc>
-        <w:tc>
-          <w:p>
-            <w:pPr>
-              <w:pStyle w:val="Compact"/>
-              <w:jc w:val="left"/>
-            </w:pPr>
-            <w:r>
-              <w:t xml:space="preserve">A− (automated update PRs + staged major-upgrade runbook)</w:t>
-            </w:r>
-          </w:p>
-        </w:tc>
-      </w:tr>
-      <w:tr>
-        <w:tc>
-          <w:p>
-            <w:pPr>
-              <w:pStyle w:val="Compact"/>
-              <w:jc w:val="left"/>
-            </w:pPr>
-            <w:r>
-              <w:t xml:space="preserve">Platform-agnostic design</w:t>
-            </w:r>
-          </w:p>
-        </w:tc>
-        <w:tc>
-          <w:p>
-            <w:pPr>
-              <w:pStyle w:val="Compact"/>
-              <w:jc w:val="left"/>
-            </w:pPr>
-            <w:r>
-              <w:t xml:space="preserve">A</w:t>
-            </w:r>
-          </w:p>
-        </w:tc>
-      </w:tr>
-    </w:tbl>
-    <w:p>
-      <w:pPr>
-        <w:pStyle w:val="Heading1"/>
-      </w:pPr>
-      <w:bookmarkStart w:id="27" w:name="integrations-ready-to-link"/>
-      <w:r>
-        <w:t xml:space="preserve">7. Integrations (ready to link)</w:t>
-      </w:r>
-      <w:bookmarkEnd w:id="27"/>
-    </w:p>
-    <w:p>
-      <w:pPr>
-        <w:pStyle w:val="FirstParagraph"/>
-      </w:pPr>
-      <w:r>
-        <w:t xml:space="preserve">The OAuth and chat-ingestion pipelines are built and unit-tested; linking them live is a credentials-and-test step.</w:t>
-      </w:r>
-    </w:p>
-    <w:tbl>
-      <w:tblPr>
-        <w:tblStyle w:val="Table"/>
-        <w:tblW w:type="pct" w:w="0.0"/>
-        <w:tblLook w:firstRow="1"/>
-      </w:tblPr>
-      <w:tblGrid/>
-      <w:tr>
-        <w:trPr>
-          <w:cnfStyle w:firstRow="1"/>
-        </w:trPr>
+              <w:jc w:val="center"/>
+            </w:pPr>
+            <w:r>
+              <w:t xml:space="preserve">AI priorities</w:t>
+            </w:r>
+          </w:p>
+        </w:tc>
         <w:tc>
           <w:tcPr>
             <w:tcBorders>
@@ -1719,10 +1227,10 @@
           <w:p>
             <w:pPr>
               <w:pStyle w:val="Compact"/>
-              <w:jc w:val="left"/>
-            </w:pPr>
-            <w:r>
-              <w:t xml:space="preserve">Platform</w:t>
+              <w:jc w:val="center"/>
+            </w:pPr>
+            <w:r>
+              <w:t xml:space="preserve">Audio</w:t>
             </w:r>
           </w:p>
         </w:tc>
@@ -1736,10 +1244,10 @@
           <w:p>
             <w:pPr>
               <w:pStyle w:val="Compact"/>
-              <w:jc w:val="left"/>
-            </w:pPr>
-            <w:r>
-              <w:t xml:space="preserve">Auth</w:t>
+              <w:jc w:val="center"/>
+            </w:pPr>
+            <w:r>
+              <w:t xml:space="preserve">Multi-platform</w:t>
             </w:r>
           </w:p>
         </w:tc>
@@ -1753,365 +1261,13 @@
           <w:p>
             <w:pPr>
               <w:pStyle w:val="Compact"/>
-              <w:jc w:val="left"/>
-            </w:pPr>
-            <w:r>
-              <w:t xml:space="preserve">Live chat read path</w:t>
-            </w:r>
-          </w:p>
-        </w:tc>
-      </w:tr>
-      <w:tr>
-        <w:tc>
-          <w:p>
-            <w:pPr>
-              <w:pStyle w:val="Compact"/>
-              <w:jc w:val="left"/>
-            </w:pPr>
-            <w:r>
-              <w:t xml:space="preserve">Twitch</w:t>
-            </w:r>
-          </w:p>
-        </w:tc>
-        <w:tc>
-          <w:p>
-            <w:pPr>
-              <w:pStyle w:val="Compact"/>
-              <w:jc w:val="left"/>
-            </w:pPr>
-            <w:r>
-              <w:t xml:space="preserve">OAuth, scope</w:t>
-            </w:r>
-            <w:r>
-              <w:t xml:space="preserve"> </w:t>
-            </w:r>
-            <w:r>
-              <w:rPr>
-                <w:rStyle w:val="VerbatimChar"/>
-              </w:rPr>
-              <w:t xml:space="preserve">user:read:chat</w:t>
-            </w:r>
-          </w:p>
-        </w:tc>
-        <w:tc>
-          <w:p>
-            <w:pPr>
-              <w:pStyle w:val="Compact"/>
-              <w:jc w:val="left"/>
-            </w:pPr>
-            <w:r>
-              <w:t xml:space="preserve">EventSub WebSocket</w:t>
-            </w:r>
-            <w:r>
-              <w:t xml:space="preserve"> </w:t>
-            </w:r>
-            <w:r>
-              <w:rPr>
-                <w:rStyle w:val="VerbatimChar"/>
-              </w:rPr>
-              <w:t xml:space="preserve">channel.chat.message</w:t>
-            </w:r>
-          </w:p>
-        </w:tc>
-      </w:tr>
-      <w:tr>
-        <w:tc>
-          <w:p>
-            <w:pPr>
-              <w:pStyle w:val="Compact"/>
-              <w:jc w:val="left"/>
-            </w:pPr>
-            <w:r>
-              <w:t xml:space="preserve">YouTube</w:t>
-            </w:r>
-          </w:p>
-        </w:tc>
-        <w:tc>
-          <w:p>
-            <w:pPr>
-              <w:pStyle w:val="Compact"/>
-              <w:jc w:val="left"/>
-            </w:pPr>
-            <w:r>
-              <w:t xml:space="preserve">Google OAuth,</w:t>
-            </w:r>
-            <w:r>
-              <w:t xml:space="preserve"> </w:t>
-            </w:r>
-            <w:r>
-              <w:rPr>
-                <w:rStyle w:val="VerbatimChar"/>
-              </w:rPr>
-              <w:t xml:space="preserve">youtube.readonly</w:t>
-            </w:r>
-          </w:p>
-        </w:tc>
-        <w:tc>
-          <w:p>
-            <w:pPr>
-              <w:pStyle w:val="Compact"/>
-              <w:jc w:val="left"/>
-            </w:pPr>
-            <w:r>
-              <w:t xml:space="preserve">Live Streaming API</w:t>
-            </w:r>
-            <w:r>
-              <w:t xml:space="preserve"> </w:t>
-            </w:r>
-            <w:r>
-              <w:rPr>
-                <w:rStyle w:val="VerbatimChar"/>
-              </w:rPr>
-              <w:t xml:space="preserve">liveChatMessages</w:t>
-            </w:r>
-          </w:p>
-        </w:tc>
-      </w:tr>
-      <w:tr>
-        <w:tc>
-          <w:p>
-            <w:pPr>
-              <w:pStyle w:val="Compact"/>
-              <w:jc w:val="left"/>
-            </w:pPr>
-            <w:r>
-              <w:t xml:space="preserve">Kick</w:t>
-            </w:r>
-          </w:p>
-        </w:tc>
-        <w:tc>
-          <w:p>
-            <w:pPr>
-              <w:pStyle w:val="Compact"/>
-              <w:jc w:val="left"/>
-            </w:pPr>
-            <w:r>
-              <w:t xml:space="preserve">OAuth 2.1 + PKCE</w:t>
-            </w:r>
-          </w:p>
-        </w:tc>
-        <w:tc>
-          <w:p>
-            <w:pPr>
-              <w:pStyle w:val="Compact"/>
-              <w:jc w:val="left"/>
-            </w:pPr>
-            <w:r>
-              <w:t xml:space="preserve">Official API chat events</w:t>
-            </w:r>
-          </w:p>
-        </w:tc>
-      </w:tr>
-    </w:tbl>
-    <w:p>
-      <w:pPr>
-        <w:pStyle w:val="BodyText"/>
-      </w:pPr>
-      <w:r>
-        <w:t xml:space="preserve">Linked-platform tokens are encrypted at rest (AES-256-GCM) and stored per tenant. Because every provider lands behind the existing PlatformAdapter seam, the salience engine, recorder, routing and analytics all work unchanged.</w:t>
-      </w:r>
-    </w:p>
-    <w:p>
-      <w:pPr>
-        <w:pStyle w:val="Heading2"/>
-      </w:pPr>
-      <w:bookmarkStart w:id="28" w:name="sdk-device-strategy"/>
-      <w:r>
-        <w:t xml:space="preserve">SDK &amp; device strategy</w:t>
-      </w:r>
-      <w:bookmarkEnd w:id="28"/>
-    </w:p>
-    <w:p>
-      <w:pPr>
-        <w:pStyle w:val="FirstParagraph"/>
-      </w:pPr>
-      <w:r>
-        <w:t xml:space="preserve">The server’s scored feed is</w:t>
-      </w:r>
-      <w:r>
-        <w:t xml:space="preserve"> </w:t>
-      </w:r>
-      <w:r>
-        <w:rPr>
-          <w:b/>
-        </w:rPr>
-        <w:t xml:space="preserve">render-agnostic</w:t>
-      </w:r>
-      <w:r>
-        <w:t xml:space="preserve"> </w:t>
-      </w:r>
-      <w:r>
-        <w:t xml:space="preserve">— it streams a single typed message protocol over WebSocket. That protocol</w:t>
-      </w:r>
-      <w:r>
-        <w:t xml:space="preserve"> </w:t>
-      </w:r>
-      <w:r>
-        <w:rPr>
-          <w:i/>
-        </w:rPr>
-        <w:t xml:space="preserve">is</w:t>
-      </w:r>
-      <w:r>
-        <w:t xml:space="preserve"> </w:t>
-      </w:r>
-      <w:r>
-        <w:t xml:space="preserve">the integration surface:</w:t>
-      </w:r>
-    </w:p>
-    <w:p>
-      <w:pPr>
-        <w:numPr>
-          <w:ilvl w:val="0"/>
-          <w:numId w:val="1003"/>
-        </w:numPr>
-        <w:pStyle w:val="Compact"/>
-      </w:pPr>
-      <w:r>
-        <w:rPr>
-          <w:b/>
-        </w:rPr>
-        <w:t xml:space="preserve">Client SDK (planned</w:t>
-      </w:r>
-      <w:r>
-        <w:rPr>
-          <w:b/>
-        </w:rPr>
-        <w:t xml:space="preserve"> </w:t>
-      </w:r>
-      <w:r>
-        <w:rPr>
-          <w:rStyle w:val="VerbatimChar"/>
-          <w:b/>
-        </w:rPr>
-        <w:t xml:space="preserve">@glance/sdk</w:t>
-      </w:r>
-      <w:r>
-        <w:rPr>
-          <w:b/>
-        </w:rPr>
-        <w:t xml:space="preserve">)</w:t>
-      </w:r>
-      <w:r>
-        <w:t xml:space="preserve"> </w:t>
-      </w:r>
-      <w:r>
-        <w:t xml:space="preserve">— a typed JS/TS client so any web or native app can subscribe to a creator’s feed with a token and render it however it likes.</w:t>
-      </w:r>
-    </w:p>
-    <w:p>
-      <w:pPr>
-        <w:numPr>
-          <w:ilvl w:val="0"/>
-          <w:numId w:val="1003"/>
-        </w:numPr>
-        <w:pStyle w:val="Compact"/>
-      </w:pPr>
-      <w:r>
-        <w:rPr>
-          <w:b/>
-        </w:rPr>
-        <w:t xml:space="preserve">Smart glasses</w:t>
-      </w:r>
-      <w:r>
-        <w:t xml:space="preserve"> </w:t>
-      </w:r>
-      <w:r>
-        <w:t xml:space="preserve">— a web-app target for Brilliant Labs / Even Realities / Meta-class devices first, then native bridges; the HUD is already presentation-light by design.</w:t>
-      </w:r>
-    </w:p>
-    <w:p>
-      <w:pPr>
-        <w:numPr>
-          <w:ilvl w:val="0"/>
-          <w:numId w:val="1003"/>
-        </w:numPr>
-        <w:pStyle w:val="Compact"/>
-      </w:pPr>
-      <w:r>
-        <w:rPr>
-          <w:b/>
-        </w:rPr>
-        <w:t xml:space="preserve">Phone companion</w:t>
-      </w:r>
-      <w:r>
-        <w:t xml:space="preserve"> </w:t>
-      </w:r>
-      <w:r>
-        <w:t xml:space="preserve">— a paired second-screen app that authenticates to the creator’s tenant and renders the routed</w:t>
-      </w:r>
-      <w:r>
-        <w:t xml:space="preserve"> </w:t>
-      </w:r>
-      <w:r>
-        <w:rPr>
-          <w:b/>
-        </w:rPr>
-        <w:t xml:space="preserve">audio</w:t>
-      </w:r>
-      <w:r>
-        <w:t xml:space="preserve">. This is the answer to</w:t>
-      </w:r>
-      <w:r>
-        <w:t xml:space="preserve"> </w:t>
-      </w:r>
-      <w:r>
-        <w:t xml:space="preserve">“</w:t>
-      </w:r>
-      <w:r>
-        <w:t xml:space="preserve">how do I get callouts while streaming Twitch from a console?</w:t>
-      </w:r>
-      <w:r>
-        <w:t xml:space="preserve">”</w:t>
-      </w:r>
-      <w:r>
-        <w:t xml:space="preserve">: even with no overlay on the capture PC, the creator hears donation/raid/question callouts in an earbud via their phone, because the companion subscribes to the same tenant feed.</w:t>
-      </w:r>
-    </w:p>
-    <w:p>
-      <w:pPr>
-        <w:pStyle w:val="Heading1"/>
-      </w:pPr>
-      <w:bookmarkStart w:id="29" w:name="monetization"/>
-      <w:r>
-        <w:t xml:space="preserve">8. Monetization</w:t>
-      </w:r>
-      <w:bookmarkEnd w:id="29"/>
-    </w:p>
-    <w:p>
-      <w:pPr>
-        <w:pStyle w:val="FirstParagraph"/>
-      </w:pPr>
-      <w:r>
-        <w:t xml:space="preserve">Subscriptions are embedded via Stripe (Checkout + Customer Portal), with</w:t>
-      </w:r>
-      <w:r>
-        <w:t xml:space="preserve"> </w:t>
-      </w:r>
-      <w:r>
-        <w:rPr>
-          <w:b/>
-        </w:rPr>
-        <w:t xml:space="preserve">webhook-first provisioning</w:t>
-      </w:r>
-      <w:r>
-        <w:t xml:space="preserve"> </w:t>
-      </w:r>
-      <w:r>
-        <w:t xml:space="preserve">— a plan is only granted when Stripe confirms payment, never optimistically from the client. The webhook signature is verified in constant time with replay protection (unit-tested). A tenant’s plan is enforced centrally: settings are clamped to the plan’s entitlements, so a downgrade simply switches gated features off rather than breaking anything.</w:t>
-      </w:r>
-    </w:p>
-    <w:tbl>
-      <w:tblPr>
-        <w:tblStyle w:val="Table"/>
-        <w:tblW w:type="pct" w:w="0.0"/>
-        <w:tblLook w:firstRow="1"/>
-      </w:tblPr>
-      <w:tblGrid/>
-      <w:tr>
-        <w:trPr>
-          <w:cnfStyle w:firstRow="1"/>
-        </w:trPr>
+              <w:jc w:val="center"/>
+            </w:pPr>
+            <w:r>
+              <w:t xml:space="preserve">Mod. actions</w:t>
+            </w:r>
+          </w:p>
+        </w:tc>
         <w:tc>
           <w:tcPr>
             <w:tcBorders>
@@ -2122,10 +1278,10 @@
           <w:p>
             <w:pPr>
               <w:pStyle w:val="Compact"/>
-              <w:jc w:val="left"/>
-            </w:pPr>
-            <w:r>
-              <w:t xml:space="preserve">Plan</w:t>
+              <w:jc w:val="center"/>
+            </w:pPr>
+            <w:r>
+              <w:t xml:space="preserve">Adv. analytics</w:t>
             </w:r>
           </w:p>
         </w:tc>
@@ -2139,10 +1295,10 @@
           <w:p>
             <w:pPr>
               <w:pStyle w:val="Compact"/>
-              <w:jc w:val="right"/>
-            </w:pPr>
-            <w:r>
-              <w:t xml:space="preserve">Price / mo</w:t>
+              <w:jc w:val="center"/>
+            </w:pPr>
+            <w:r>
+              <w:t xml:space="preserve">Branding</w:t>
             </w:r>
           </w:p>
         </w:tc>
@@ -2156,10 +1312,10 @@
           <w:p>
             <w:pPr>
               <w:pStyle w:val="Compact"/>
-              <w:jc w:val="left"/>
-            </w:pPr>
-            <w:r>
-              <w:t xml:space="preserve">Retention</w:t>
+              <w:jc w:val="center"/>
+            </w:pPr>
+            <w:r>
+              <w:t xml:space="preserve">Teams</w:t>
             </w:r>
           </w:p>
         </w:tc>
@@ -2176,57 +1332,6 @@
               <w:jc w:val="center"/>
             </w:pPr>
             <w:r>
-              <w:t xml:space="preserve">AI priorities</w:t>
-            </w:r>
-          </w:p>
-        </w:tc>
-        <w:tc>
-          <w:tcPr>
-            <w:tcBorders>
-              <w:bottom w:val="single"/>
-            </w:tcBorders>
-            <w:vAlign w:val="bottom"/>
-          </w:tcPr>
-          <w:p>
-            <w:pPr>
-              <w:pStyle w:val="Compact"/>
-              <w:jc w:val="center"/>
-            </w:pPr>
-            <w:r>
-              <w:t xml:space="preserve">Audio routing</w:t>
-            </w:r>
-          </w:p>
-        </w:tc>
-        <w:tc>
-          <w:tcPr>
-            <w:tcBorders>
-              <w:bottom w:val="single"/>
-            </w:tcBorders>
-            <w:vAlign w:val="bottom"/>
-          </w:tcPr>
-          <w:p>
-            <w:pPr>
-              <w:pStyle w:val="Compact"/>
-              <w:jc w:val="center"/>
-            </w:pPr>
-            <w:r>
-              <w:t xml:space="preserve">Multi-platform</w:t>
-            </w:r>
-          </w:p>
-        </w:tc>
-        <w:tc>
-          <w:tcPr>
-            <w:tcBorders>
-              <w:bottom w:val="single"/>
-            </w:tcBorders>
-            <w:vAlign w:val="bottom"/>
-          </w:tcPr>
-          <w:p>
-            <w:pPr>
-              <w:pStyle w:val="Compact"/>
-              <w:jc w:val="center"/>
-            </w:pPr>
-            <w:r>
               <w:t xml:space="preserve">Seats</w:t>
             </w:r>
           </w:p>
@@ -2251,7 +1356,18 @@
               <w:jc w:val="right"/>
             </w:pPr>
             <w:r>
-              <w:t xml:space="preserve">$0</w:t>
+              <w:t xml:space="preserve">0</w:t>
+            </w:r>
+          </w:p>
+        </w:tc>
+        <w:tc>
+          <w:p>
+            <w:pPr>
+              <w:pStyle w:val="Compact"/>
+              <w:jc w:val="right"/>
+            </w:pPr>
+            <w:r>
+              <w:t xml:space="preserve">500</w:t>
             </w:r>
           </w:p>
         </w:tc>
@@ -2273,7 +1389,7 @@
               <w:jc w:val="center"/>
             </w:pPr>
             <w:r>
-              <w:t xml:space="preserve">—</w:t>
+              <w:t xml:space="preserve">–</w:t>
             </w:r>
           </w:p>
         </w:tc>
@@ -2284,7 +1400,7 @@
               <w:jc w:val="center"/>
             </w:pPr>
             <w:r>
-              <w:t xml:space="preserve">—</w:t>
+              <w:t xml:space="preserve">–</w:t>
             </w:r>
           </w:p>
         </w:tc>
@@ -2295,7 +1411,51 @@
               <w:jc w:val="center"/>
             </w:pPr>
             <w:r>
-              <w:t xml:space="preserve">—</w:t>
+              <w:t xml:space="preserve">–</w:t>
+            </w:r>
+          </w:p>
+        </w:tc>
+        <w:tc>
+          <w:p>
+            <w:pPr>
+              <w:pStyle w:val="Compact"/>
+              <w:jc w:val="center"/>
+            </w:pPr>
+            <w:r>
+              <w:t xml:space="preserve">–</w:t>
+            </w:r>
+          </w:p>
+        </w:tc>
+        <w:tc>
+          <w:p>
+            <w:pPr>
+              <w:pStyle w:val="Compact"/>
+              <w:jc w:val="center"/>
+            </w:pPr>
+            <w:r>
+              <w:t xml:space="preserve">–</w:t>
+            </w:r>
+          </w:p>
+        </w:tc>
+        <w:tc>
+          <w:p>
+            <w:pPr>
+              <w:pStyle w:val="Compact"/>
+              <w:jc w:val="center"/>
+            </w:pPr>
+            <w:r>
+              <w:t xml:space="preserve">–</w:t>
+            </w:r>
+          </w:p>
+        </w:tc>
+        <w:tc>
+          <w:p>
+            <w:pPr>
+              <w:pStyle w:val="Compact"/>
+              <w:jc w:val="center"/>
+            </w:pPr>
+            <w:r>
+              <w:t xml:space="preserve">–</w:t>
             </w:r>
           </w:p>
         </w:tc>
@@ -2330,7 +1490,18 @@
               <w:jc w:val="right"/>
             </w:pPr>
             <w:r>
-              <w:t xml:space="preserve">$12</w:t>
+              <w:t xml:space="preserve">18</w:t>
+            </w:r>
+          </w:p>
+        </w:tc>
+        <w:tc>
+          <w:p>
+            <w:pPr>
+              <w:pStyle w:val="Compact"/>
+              <w:jc w:val="right"/>
+            </w:pPr>
+            <w:r>
+              <w:t xml:space="preserve">10,000</w:t>
             </w:r>
           </w:p>
         </w:tc>
@@ -2352,7 +1523,7 @@
               <w:jc w:val="center"/>
             </w:pPr>
             <w:r>
-              <w:t xml:space="preserve">Yes</w:t>
+              <w:t xml:space="preserve">✓</w:t>
             </w:r>
           </w:p>
         </w:tc>
@@ -2363,7 +1534,7 @@
               <w:jc w:val="center"/>
             </w:pPr>
             <w:r>
-              <w:t xml:space="preserve">Yes</w:t>
+              <w:t xml:space="preserve">✓</w:t>
             </w:r>
           </w:p>
         </w:tc>
@@ -2374,7 +1545,51 @@
               <w:jc w:val="center"/>
             </w:pPr>
             <w:r>
-              <w:t xml:space="preserve">—</w:t>
+              <w:t xml:space="preserve">✓</w:t>
+            </w:r>
+          </w:p>
+        </w:tc>
+        <w:tc>
+          <w:p>
+            <w:pPr>
+              <w:pStyle w:val="Compact"/>
+              <w:jc w:val="center"/>
+            </w:pPr>
+            <w:r>
+              <w:t xml:space="preserve">–</w:t>
+            </w:r>
+          </w:p>
+        </w:tc>
+        <w:tc>
+          <w:p>
+            <w:pPr>
+              <w:pStyle w:val="Compact"/>
+              <w:jc w:val="center"/>
+            </w:pPr>
+            <w:r>
+              <w:t xml:space="preserve">–</w:t>
+            </w:r>
+          </w:p>
+        </w:tc>
+        <w:tc>
+          <w:p>
+            <w:pPr>
+              <w:pStyle w:val="Compact"/>
+              <w:jc w:val="center"/>
+            </w:pPr>
+            <w:r>
+              <w:t xml:space="preserve">–</w:t>
+            </w:r>
+          </w:p>
+        </w:tc>
+        <w:tc>
+          <w:p>
+            <w:pPr>
+              <w:pStyle w:val="Compact"/>
+              <w:jc w:val="center"/>
+            </w:pPr>
+            <w:r>
+              <w:t xml:space="preserve">–</w:t>
             </w:r>
           </w:p>
         </w:tc>
@@ -2409,7 +1624,18 @@
               <w:jc w:val="right"/>
             </w:pPr>
             <w:r>
-              <w:t xml:space="preserve">$39</w:t>
+              <w:t xml:space="preserve">49</w:t>
+            </w:r>
+          </w:p>
+        </w:tc>
+        <w:tc>
+          <w:p>
+            <w:pPr>
+              <w:pStyle w:val="Compact"/>
+              <w:jc w:val="right"/>
+            </w:pPr>
+            <w:r>
+              <w:t xml:space="preserve">200,000</w:t>
             </w:r>
           </w:p>
         </w:tc>
@@ -2431,7 +1657,7 @@
               <w:jc w:val="center"/>
             </w:pPr>
             <w:r>
-              <w:t xml:space="preserve">Yes</w:t>
+              <w:t xml:space="preserve">✓</w:t>
             </w:r>
           </w:p>
         </w:tc>
@@ -2442,7 +1668,7 @@
               <w:jc w:val="center"/>
             </w:pPr>
             <w:r>
-              <w:t xml:space="preserve">Yes</w:t>
+              <w:t xml:space="preserve">✓</w:t>
             </w:r>
           </w:p>
         </w:tc>
@@ -2453,7 +1679,51 @@
               <w:jc w:val="center"/>
             </w:pPr>
             <w:r>
-              <w:t xml:space="preserve">Yes</w:t>
+              <w:t xml:space="preserve">✓</w:t>
+            </w:r>
+          </w:p>
+        </w:tc>
+        <w:tc>
+          <w:p>
+            <w:pPr>
+              <w:pStyle w:val="Compact"/>
+              <w:jc w:val="center"/>
+            </w:pPr>
+            <w:r>
+              <w:t xml:space="preserve">✓</w:t>
+            </w:r>
+          </w:p>
+        </w:tc>
+        <w:tc>
+          <w:p>
+            <w:pPr>
+              <w:pStyle w:val="Compact"/>
+              <w:jc w:val="center"/>
+            </w:pPr>
+            <w:r>
+              <w:t xml:space="preserve">✓</w:t>
+            </w:r>
+          </w:p>
+        </w:tc>
+        <w:tc>
+          <w:p>
+            <w:pPr>
+              <w:pStyle w:val="Compact"/>
+              <w:jc w:val="center"/>
+            </w:pPr>
+            <w:r>
+              <w:t xml:space="preserve">✓</w:t>
+            </w:r>
+          </w:p>
+        </w:tc>
+        <w:tc>
+          <w:p>
+            <w:pPr>
+              <w:pStyle w:val="Compact"/>
+              <w:jc w:val="center"/>
+            </w:pPr>
+            <w:r>
+              <w:t xml:space="preserve">✓</w:t>
             </w:r>
           </w:p>
         </w:tc>
@@ -2475,18 +1745,18 @@
         <w:pStyle w:val="BodyText"/>
       </w:pPr>
       <w:r>
-        <w:t xml:space="preserve">The free tier is a genuine on-ramp (the assistant works); paid tiers unlock the hands-free audio routing, Claude re-ranking, longer history, and multi-platform — the features power-users and multi-streamers value most.</w:t>
+        <w:t xml:space="preserve">The free tier is a genuine on-ramp; paid tiers unlock hands-free audio, Claude re-ranking, longer history and multi-platform (Creator), then automated moderation, cross-session analytics, branded overlays and team seats (Pro).</w:t>
       </w:r>
     </w:p>
     <w:p>
       <w:pPr>
         <w:pStyle w:val="Heading1"/>
       </w:pPr>
-      <w:bookmarkStart w:id="30" w:name="roadmap"/>
+      <w:bookmarkStart w:id="28" w:name="roadmap"/>
       <w:r>
         <w:t xml:space="preserve">9. Roadmap</w:t>
       </w:r>
-      <w:bookmarkEnd w:id="30"/>
+      <w:bookmarkEnd w:id="28"/>
     </w:p>
     <w:p>
       <w:pPr>
@@ -2502,7 +1772,7 @@
         <w:t xml:space="preserve"> </w:t>
       </w:r>
       <w:r>
-        <w:t xml:space="preserve">Mount and live-test the OAuth routes; take Stripe live; add the dashboard privacy/plan controls; load-test to thousands of concurrent tenants; run a formal security review; merge the first batch of automated dependency PRs.</w:t>
+        <w:t xml:space="preserve">Mount + live-test the OAuth and billing routes; take Stripe live; load-test to thousands of tenants; external security review.</w:t>
       </w:r>
     </w:p>
     <w:p>
@@ -2519,7 +1789,7 @@
         <w:t xml:space="preserve"> </w:t>
       </w:r>
       <w:r>
-        <w:t xml:space="preserve">Ship the live Twitch EventSub, YouTube and Kick adapters; build the phone companion app (paired audio second-screen); publish</w:t>
+        <w:t xml:space="preserve">Ship the live YouTube and Kick adapters (alongside the built Twitch EventSub one); per-member team login; the phone companion app; publish</w:t>
       </w:r>
       <w:r>
         <w:t xml:space="preserve"> </w:t>
@@ -2531,7 +1801,7 @@
         <w:t xml:space="preserve">@glance/sdk</w:t>
       </w:r>
       <w:r>
-        <w:t xml:space="preserve">; ship a smart-glasses web-app target.</w:t>
+        <w:t xml:space="preserve">; a smart-glasses web-app target.</w:t>
       </w:r>
     </w:p>
     <w:p>
@@ -2548,18 +1818,18 @@
         <w:t xml:space="preserve"> </w:t>
       </w:r>
       <w:r>
-        <w:t xml:space="preserve">Native glasses integrations; experiment with on-device salience for ultra-low latency; team seats and agency/enterprise tiers; deeper analytics and clip-generation from session replays; a marketplace of community salience presets.</w:t>
+        <w:t xml:space="preserve">Native glasses integrations; on-device salience; deeper analytics and clip generation; a marketplace of community salience presets.</w:t>
       </w:r>
     </w:p>
     <w:p>
       <w:pPr>
         <w:pStyle w:val="Heading1"/>
       </w:pPr>
-      <w:bookmarkStart w:id="31" w:name="whats-left-before-launch"/>
+      <w:bookmarkStart w:id="29" w:name="whats-left-before-launch"/>
       <w:r>
         <w:t xml:space="preserve">10. What’s left before launch</w:t>
       </w:r>
-      <w:bookmarkEnd w:id="31"/>
+      <w:bookmarkEnd w:id="29"/>
     </w:p>
     <w:tbl>
       <w:tblPr>
@@ -2636,7 +1906,7 @@
               <w:jc w:val="left"/>
             </w:pPr>
             <w:r>
-              <w:t xml:space="preserve">Wire OAuth start/callback routes + live test per provider</w:t>
+              <w:t xml:space="preserve">Mount OAuth start/callback routes + live test</w:t>
             </w:r>
           </w:p>
         </w:tc>
@@ -2658,7 +1928,7 @@
               <w:jc w:val="left"/>
             </w:pPr>
             <w:r>
-              <w:t xml:space="preserve">Pipelines built &amp; tested; wiring pending credentials</w:t>
+              <w:t xml:space="preserve">Pipelines + Twitch adapter built; routes + creds pending</w:t>
             </w:r>
           </w:p>
         </w:tc>
@@ -2671,7 +1941,7 @@
               <w:jc w:val="left"/>
             </w:pPr>
             <w:r>
-              <w:t xml:space="preserve">Take Stripe live (keys, prices, webhook endpoint)</w:t>
+              <w:t xml:space="preserve">Take Stripe live (keys, prices, webhook)</w:t>
             </w:r>
           </w:p>
         </w:tc>
@@ -2693,7 +1963,7 @@
               <w:jc w:val="left"/>
             </w:pPr>
             <w:r>
-              <w:t xml:space="preserve">Model, webhook verify &amp; gating built &amp; tested</w:t>
+              <w:t xml:space="preserve">Model, webhook verify, gating, AI caps built &amp; tested</w:t>
             </w:r>
           </w:p>
         </w:tc>
@@ -2706,29 +1976,29 @@
               <w:jc w:val="left"/>
             </w:pPr>
             <w:r>
-              <w:t xml:space="preserve">Dashboard UI for privacy + plan controls</w:t>
-            </w:r>
-          </w:p>
-        </w:tc>
-        <w:tc>
-          <w:p>
-            <w:pPr>
-              <w:pStyle w:val="Compact"/>
-              <w:jc w:val="left"/>
-            </w:pPr>
-            <w:r>
-              <w:t xml:space="preserve">Frontend</w:t>
-            </w:r>
-          </w:p>
-        </w:tc>
-        <w:tc>
-          <w:p>
-            <w:pPr>
-              <w:pStyle w:val="Compact"/>
-              <w:jc w:val="left"/>
-            </w:pPr>
-            <w:r>
-              <w:t xml:space="preserve">Backend + API complete; UI pending</w:t>
+              <w:t xml:space="preserve">Per-member team login</w:t>
+            </w:r>
+          </w:p>
+        </w:tc>
+        <w:tc>
+          <w:p>
+            <w:pPr>
+              <w:pStyle w:val="Compact"/>
+              <w:jc w:val="left"/>
+            </w:pPr>
+            <w:r>
+              <w:t xml:space="preserve">Teams</w:t>
+            </w:r>
+          </w:p>
+        </w:tc>
+        <w:tc>
+          <w:p>
+            <w:pPr>
+              <w:pStyle w:val="Compact"/>
+              <w:jc w:val="left"/>
+            </w:pPr>
+            <w:r>
+              <w:t xml:space="preserve">Roster, roles, seats built; member auth pending</w:t>
             </w:r>
           </w:p>
         </w:tc>
@@ -2741,29 +2011,29 @@
               <w:jc w:val="left"/>
             </w:pPr>
             <w:r>
-              <w:t xml:space="preserve">Load test to thousands of tenants/connections</w:t>
-            </w:r>
-          </w:p>
-        </w:tc>
-        <w:tc>
-          <w:p>
-            <w:pPr>
-              <w:pStyle w:val="Compact"/>
-              <w:jc w:val="left"/>
-            </w:pPr>
-            <w:r>
-              <w:t xml:space="preserve">Scale</w:t>
-            </w:r>
-          </w:p>
-        </w:tc>
-        <w:tc>
-          <w:p>
-            <w:pPr>
-              <w:pStyle w:val="Compact"/>
-              <w:jc w:val="left"/>
-            </w:pPr>
-            <w:r>
-              <w:t xml:space="preserve">Architecture ready (Hub + Bus); test pending</w:t>
+              <w:t xml:space="preserve">Live YouTube + Kick adapters</w:t>
+            </w:r>
+          </w:p>
+        </w:tc>
+        <w:tc>
+          <w:p>
+            <w:pPr>
+              <w:pStyle w:val="Compact"/>
+              <w:jc w:val="left"/>
+            </w:pPr>
+            <w:r>
+              <w:t xml:space="preserve">Platform</w:t>
+            </w:r>
+          </w:p>
+        </w:tc>
+        <w:tc>
+          <w:p>
+            <w:pPr>
+              <w:pStyle w:val="Compact"/>
+              <w:jc w:val="left"/>
+            </w:pPr>
+            <w:r>
+              <w:t xml:space="preserve">Twitch EventSub built; others follow the same seam</w:t>
             </w:r>
           </w:p>
         </w:tc>
@@ -2776,29 +2046,29 @@
               <w:jc w:val="left"/>
             </w:pPr>
             <w:r>
-              <w:t xml:space="preserve">External security review</w:t>
-            </w:r>
-          </w:p>
-        </w:tc>
-        <w:tc>
-          <w:p>
-            <w:pPr>
-              <w:pStyle w:val="Compact"/>
-              <w:jc w:val="left"/>
-            </w:pPr>
-            <w:r>
-              <w:t xml:space="preserve">Security</w:t>
-            </w:r>
-          </w:p>
-        </w:tc>
-        <w:tc>
-          <w:p>
-            <w:pPr>
-              <w:pStyle w:val="Compact"/>
-              <w:jc w:val="left"/>
-            </w:pPr>
-            <w:r>
-              <w:t xml:space="preserve">Hardened to A−; review pending</w:t>
+              <w:t xml:space="preserve">Load test to thousands of tenants</w:t>
+            </w:r>
+          </w:p>
+        </w:tc>
+        <w:tc>
+          <w:p>
+            <w:pPr>
+              <w:pStyle w:val="Compact"/>
+              <w:jc w:val="left"/>
+            </w:pPr>
+            <w:r>
+              <w:t xml:space="preserve">Scale</w:t>
+            </w:r>
+          </w:p>
+        </w:tc>
+        <w:tc>
+          <w:p>
+            <w:pPr>
+              <w:pStyle w:val="Compact"/>
+              <w:jc w:val="left"/>
+            </w:pPr>
+            <w:r>
+              <w:t xml:space="preserve">Architecture ready (Hub + Bus)</w:t>
             </w:r>
           </w:p>
         </w:tc>
@@ -2811,29 +2081,29 @@
               <w:jc w:val="left"/>
             </w:pPr>
             <w:r>
-              <w:t xml:space="preserve">Staged major dependency upgrades</w:t>
-            </w:r>
-          </w:p>
-        </w:tc>
-        <w:tc>
-          <w:p>
-            <w:pPr>
-              <w:pStyle w:val="Compact"/>
-              <w:jc w:val="left"/>
-            </w:pPr>
-            <w:r>
-              <w:t xml:space="preserve">Maintenance</w:t>
-            </w:r>
-          </w:p>
-        </w:tc>
-        <w:tc>
-          <w:p>
-            <w:pPr>
-              <w:pStyle w:val="Compact"/>
-              <w:jc w:val="left"/>
-            </w:pPr>
-            <w:r>
-              <w:t xml:space="preserve">Runbook + automation in place</w:t>
+              <w:t xml:space="preserve">External security review</w:t>
+            </w:r>
+          </w:p>
+        </w:tc>
+        <w:tc>
+          <w:p>
+            <w:pPr>
+              <w:pStyle w:val="Compact"/>
+              <w:jc w:val="left"/>
+            </w:pPr>
+            <w:r>
+              <w:t xml:space="preserve">Security</w:t>
+            </w:r>
+          </w:p>
+        </w:tc>
+        <w:tc>
+          <w:p>
+            <w:pPr>
+              <w:pStyle w:val="Compact"/>
+              <w:jc w:val="left"/>
+            </w:pPr>
+            <w:r>
+              <w:t xml:space="preserve">Hardened to A−</w:t>
             </w:r>
           </w:p>
         </w:tc>
@@ -2846,7 +2116,7 @@
               <w:jc w:val="left"/>
             </w:pPr>
             <w:r>
-              <w:t xml:space="preserve">Smart-glasses hardware partner &amp; target</w:t>
+              <w:t xml:space="preserve">Smart-glasses target + phone companion</w:t>
             </w:r>
           </w:p>
         </w:tc>
@@ -2868,7 +2138,7 @@
               <w:jc w:val="left"/>
             </w:pPr>
             <w:r>
-              <w:t xml:space="preserve">Render seam ready</w:t>
+              <w:t xml:space="preserve">Render seam + protocol ready</w:t>
             </w:r>
           </w:p>
         </w:tc>
@@ -2878,23 +2148,17 @@
       <w:pPr>
         <w:pStyle w:val="Heading1"/>
       </w:pPr>
-      <w:bookmarkStart w:id="32" w:name="appendix-running-it"/>
+      <w:bookmarkStart w:id="30" w:name="appendix-running-it"/>
       <w:r>
         <w:t xml:space="preserve">11. Appendix — running it</w:t>
       </w:r>
-      <w:bookmarkEnd w:id="32"/>
+      <w:bookmarkEnd w:id="30"/>
     </w:p>
     <w:p>
       <w:pPr>
         <w:pStyle w:val="FirstParagraph"/>
       </w:pPr>
       <w:r>
-        <w:t xml:space="preserve">The repository is a pnpm workspace.</w:t>
-      </w:r>
-      <w:r>
-        <w:t xml:space="preserve"> </w:t>
-      </w:r>
-      <w:r>
         <w:rPr>
           <w:rStyle w:val="VerbatimChar"/>
         </w:rPr>
@@ -2919,7 +2183,7 @@
         <w:t xml:space="preserve"> </w:t>
       </w:r>
       <w:r>
-        <w:t xml:space="preserve">starts the server (with a built-in demo chat), the HUD overlay, and the Command Center dashboard.</w:t>
+        <w:t xml:space="preserve">starts the server (with a demo chat), the HUD overlay, and the Command Center (Live · Replay · Analytics).</w:t>
       </w:r>
       <w:r>
         <w:t xml:space="preserve"> </w:t>
@@ -2934,7 +2198,7 @@
         <w:t xml:space="preserve"> </w:t>
       </w:r>
       <w:r>
-        <w:t xml:space="preserve">runs the full gate: typecheck, lint, the unit-test suite, and a production build. Configuration is via environment variables documented in the repo’s README and</w:t>
+        <w:t xml:space="preserve">runs typecheck, lint, the unit suite, and a production build. Configuration is via environment variables documented in the README and</w:t>
       </w:r>
       <w:r>
         <w:t xml:space="preserve"> </w:t>
@@ -3192,9 +2456,6 @@
     <w:abstractNumId w:val="991"/>
   </w:num>
   <w:num w:numId="1002">
-    <w:abstractNumId w:val="991"/>
-  </w:num>
-  <w:num w:numId="1003">
     <w:abstractNumId w:val="991"/>
   </w:num>
 </w:numbering>

</xml_diff>